<commit_message>
Align CV career summary years with experience section and tidy wording
Co-Authored-By: Claude Opus 5.5 <noreply@anthropic.com>
Claude-Session: https://claude.ai/code/session_01CA6dBC7aRGXKvdWTC2kB5H
</commit_message>
<xml_diff>
--- a/Jane_Chew_CV_DBA_APELQ.docx
+++ b/Jane_Chew_CV_DBA_APELQ.docx
@@ -71,16 +71,7 @@
     </w:p>
     <w:p>
       <w:r>
-        <w:t xml:space="preserve">Business practitioner with </w:t>
-      </w:r>
-      <w:r>
-        <w:rPr>
-          <w:highlight w:val="yellow"/>
-        </w:rPr>
-        <w:t>[26+]</w:t>
-      </w:r>
-      <w:r>
-        <w:t xml:space="preserve"> years of experience across customer analytics, CRM and loyalty marketing, digital business and AI strategy. Career spans an international marketing agency (OgilvyOne Worldwide), a regional bank (OCBC Bank, eight years as Head of Customer Analytics &amp; CRM), a global loyalty firm (Aimia / Carlson Marketing), seven years building and running a digital membership business, and, since 2024, founding an AI strategy consultancy and business community.</w:t>
+        <w:t>Business practitioner with 27 years of experience across customer analytics, CRM and loyalty marketing, digital business, AI strategy and entrepreneurship. Career spans market research and database marketing consultancy (MMS Consultancy, Kuala Lumpur and Bangkok), an international marketing agency (OgilvyOne Worldwide), a regional bank (OCBC Bank, nine years as Head of Customer Analytics &amp; CRM), a global loyalty firm (Aimia / Carlson Marketing), nine years building and running a digital membership business, and, since 2024, founding and running an AI strategy consultancy and business community.</w:t>
       </w:r>
     </w:p>
     <w:p>
@@ -291,18 +282,7 @@
               <w:rPr>
                 <w:sz w:val="20"/>
               </w:rPr>
-            </w:r>
-            <w:r>
-              <w:rPr>
-                <w:sz w:val="20"/>
-                <w:highlight w:val="yellow"/>
-              </w:rPr>
-              <w:t>[2020 – 2024]</w:t>
-            </w:r>
-            <w:r>
-              <w:rPr>
-                <w:sz w:val="20"/>
-              </w:rPr>
+              <w:t>2024 – 2025</w:t>
             </w:r>
           </w:p>
         </w:tc>
@@ -320,18 +300,7 @@
               <w:rPr>
                 <w:sz w:val="20"/>
               </w:rPr>
-            </w:r>
-            <w:r>
-              <w:rPr>
-                <w:sz w:val="20"/>
-                <w:highlight w:val="yellow"/>
-              </w:rPr>
-              <w:t>[Organisation / independent practice]</w:t>
-            </w:r>
-            <w:r>
-              <w:rPr>
-                <w:sz w:val="20"/>
-              </w:rPr>
+              <w:t>10x Strategy Coach</w:t>
             </w:r>
           </w:p>
         </w:tc>
@@ -349,18 +318,7 @@
               <w:rPr>
                 <w:sz w:val="20"/>
               </w:rPr>
-            </w:r>
-            <w:r>
-              <w:rPr>
-                <w:sz w:val="20"/>
-                <w:highlight w:val="yellow"/>
-              </w:rPr>
-              <w:t>[Position]</w:t>
-            </w:r>
-            <w:r>
-              <w:rPr>
-                <w:sz w:val="20"/>
-              </w:rPr>
+              <w:t>Strategy Coach (concurrent)</w:t>
             </w:r>
           </w:p>
         </w:tc>
@@ -378,18 +336,7 @@
               <w:rPr>
                 <w:sz w:val="20"/>
               </w:rPr>
-            </w:r>
-            <w:r>
-              <w:rPr>
-                <w:sz w:val="20"/>
-                <w:highlight w:val="yellow"/>
-              </w:rPr>
-              <w:t>[4]</w:t>
-            </w:r>
-            <w:r>
-              <w:rPr>
-                <w:sz w:val="20"/>
-              </w:rPr>
+              <w:t>1</w:t>
             </w:r>
           </w:p>
         </w:tc>
@@ -409,7 +356,7 @@
               <w:rPr>
                 <w:sz w:val="20"/>
               </w:rPr>
-              <w:t>2013 – 2020</w:t>
+              <w:t>2014 – 2023</w:t>
             </w:r>
           </w:p>
         </w:tc>
@@ -427,7 +374,7 @@
               <w:rPr>
                 <w:sz w:val="20"/>
               </w:rPr>
-              <w:t>DIY Jewelry Making Membership Program</w:t>
+              <w:t>DIY Jewelry Making Membership Platform</w:t>
             </w:r>
           </w:p>
         </w:tc>
@@ -463,7 +410,7 @@
               <w:rPr>
                 <w:sz w:val="20"/>
               </w:rPr>
-              <w:t>7</w:t>
+              <w:t>9</w:t>
             </w:r>
           </w:p>
         </w:tc>
@@ -483,7 +430,7 @@
               <w:rPr>
                 <w:sz w:val="20"/>
               </w:rPr>
-              <w:t>2011 – 2012</w:t>
+              <w:t>2011 – 2013</w:t>
             </w:r>
           </w:p>
         </w:tc>
@@ -537,7 +484,7 @@
               <w:rPr>
                 <w:sz w:val="20"/>
               </w:rPr>
-              <w:t>1–2</w:t>
+              <w:t>2</w:t>
             </w:r>
           </w:p>
         </w:tc>
@@ -557,7 +504,7 @@
               <w:rPr>
                 <w:sz w:val="20"/>
               </w:rPr>
-              <w:t>2003 – 2011</w:t>
+              <w:t>2002 – 2011</w:t>
             </w:r>
           </w:p>
         </w:tc>
@@ -611,7 +558,7 @@
               <w:rPr>
                 <w:sz w:val="20"/>
               </w:rPr>
-              <w:t>8</w:t>
+              <w:t>9</w:t>
             </w:r>
           </w:p>
         </w:tc>
@@ -631,7 +578,7 @@
               <w:rPr>
                 <w:sz w:val="20"/>
               </w:rPr>
-              <w:t>2000 – 2003</w:t>
+              <w:t>2000 – 2002</w:t>
             </w:r>
           </w:p>
         </w:tc>
@@ -685,7 +632,7 @@
               <w:rPr>
                 <w:sz w:val="20"/>
               </w:rPr>
-              <w:t>3</w:t>
+              <w:t>2</w:t>
             </w:r>
           </w:p>
         </w:tc>
@@ -705,18 +652,7 @@
               <w:rPr>
                 <w:sz w:val="20"/>
               </w:rPr>
-            </w:r>
-            <w:r>
-              <w:rPr>
-                <w:sz w:val="20"/>
-                <w:highlight w:val="yellow"/>
-              </w:rPr>
-              <w:t>[1997 – 2000]</w:t>
-            </w:r>
-            <w:r>
-              <w:rPr>
-                <w:sz w:val="20"/>
-              </w:rPr>
+              <w:t>1997 – 2000</w:t>
             </w:r>
           </w:p>
         </w:tc>
@@ -734,18 +670,7 @@
               <w:rPr>
                 <w:sz w:val="20"/>
               </w:rPr>
-            </w:r>
-            <w:r>
-              <w:rPr>
-                <w:sz w:val="20"/>
-                <w:highlight w:val="yellow"/>
-              </w:rPr>
-              <w:t>[First employer after UKM]</w:t>
-            </w:r>
-            <w:r>
-              <w:rPr>
-                <w:sz w:val="20"/>
-              </w:rPr>
+              <w:t>MMS Consultancy Sdn Bhd</w:t>
             </w:r>
           </w:p>
         </w:tc>
@@ -763,18 +688,7 @@
               <w:rPr>
                 <w:sz w:val="20"/>
               </w:rPr>
-            </w:r>
-            <w:r>
-              <w:rPr>
-                <w:sz w:val="20"/>
-                <w:highlight w:val="yellow"/>
-              </w:rPr>
-              <w:t>[Position]</w:t>
-            </w:r>
-            <w:r>
-              <w:rPr>
-                <w:sz w:val="20"/>
-              </w:rPr>
+              <w:t>Assistant Branch Manager, Kuala Lumpur / Bangkok</w:t>
             </w:r>
           </w:p>
         </w:tc>
@@ -792,18 +706,7 @@
               <w:rPr>
                 <w:sz w:val="20"/>
               </w:rPr>
-            </w:r>
-            <w:r>
-              <w:rPr>
-                <w:sz w:val="20"/>
-                <w:highlight w:val="yellow"/>
-              </w:rPr>
-              <w:t>[3]</w:t>
-            </w:r>
-            <w:r>
-              <w:rPr>
-                <w:sz w:val="20"/>
-              </w:rPr>
+              <w:t>3</w:t>
             </w:r>
           </w:p>
         </w:tc>
@@ -875,18 +778,7 @@
               <w:rPr>
                 <w:sz w:val="20"/>
               </w:rPr>
-            </w:r>
-            <w:r>
-              <w:rPr>
-                <w:sz w:val="20"/>
-                <w:highlight w:val="yellow"/>
-              </w:rPr>
-              <w:t>[26–29]</w:t>
-            </w:r>
-            <w:r>
-              <w:rPr>
-                <w:sz w:val="20"/>
-              </w:rPr>
+              <w:t>27+</w:t>
             </w:r>
           </w:p>
         </w:tc>
@@ -993,16 +885,7 @@
         <w:spacing w:after="20"/>
       </w:pPr>
       <w:r>
-        <w:t xml:space="preserve">Clients include Plytec Bhd, Widad Group Bhd, PKNS, Universiti Sultan Azlan Shah and Automation &amp; Control Systems Sdn Bhd </w:t>
-      </w:r>
-      <w:r>
-        <w:rPr>
-          <w:highlight w:val="yellow"/>
-        </w:rPr>
-        <w:t>[add 1–2 measurable client outcomes]</w:t>
-      </w:r>
-      <w:r>
-        <w:t>.</w:t>
+        <w:t>Clients include Automation &amp; Control Systems Sdn Bhd, Widad Group Bhd, PKNS, Universiti Sultan Azlan Shah and IBBN.net.</w:t>
       </w:r>
     </w:p>
     <w:p>
@@ -1014,13 +897,13 @@
         <w:rPr>
           <w:b/>
         </w:rPr>
-        <w:t>[[Position]]</w:t>
+        <w:t>Strategy Coach</w:t>
       </w:r>
       <w:r>
         <w:rPr>
           <w:color w:val="555555"/>
         </w:rPr>
-        <w:t xml:space="preserve">  |  [[2020 – 2024]]</w:t>
+        <w:t xml:space="preserve">  |  2024 – 2025</w:t>
       </w:r>
     </w:p>
     <w:p>
@@ -1031,18 +914,7 @@
         <w:rPr>
           <w:i/>
         </w:rPr>
-      </w:r>
-      <w:r>
-        <w:rPr>
-          <w:i/>
-          <w:highlight w:val="yellow"/>
-        </w:rPr>
-        <w:t>[Organisation / independent practice]</w:t>
-      </w:r>
-      <w:r>
-        <w:rPr>
-          <w:i/>
-        </w:rPr>
+        <w:t>10x Strategy Coach</w:t>
       </w:r>
     </w:p>
     <w:p>
@@ -1050,14 +922,9 @@
         <w:pStyle w:val="ListBullet"/>
         <w:spacing w:after="20"/>
       </w:pPr>
-      <w:r/>
       <w:r>
-        <w:rPr>
-          <w:highlight w:val="yellow"/>
-        </w:rPr>
-        <w:t>[Describe work in this period: consulting, coaching, digital business, study. Assessors will count gaps against the 25-year threshold.]</w:t>
+        <w:t>Coached and advised SME owners on revamping second-generation family businesses, covering corporate strategy, branding, marketing and KPIs.</w:t>
       </w:r>
-      <w:r/>
     </w:p>
     <w:p>
       <w:pPr>
@@ -1074,7 +941,7 @@
         <w:rPr>
           <w:color w:val="555555"/>
         </w:rPr>
-        <w:t xml:space="preserve">  |  2013 – 2020</w:t>
+        <w:t xml:space="preserve">  |  2014 – 2023</w:t>
       </w:r>
     </w:p>
     <w:p>
@@ -1085,7 +952,7 @@
         <w:rPr>
           <w:i/>
         </w:rPr>
-        <w:t>DIY Jewelry Making Membership Program</w:t>
+        <w:t>DIY Jewelry Making Membership Platform</w:t>
       </w:r>
     </w:p>
     <w:p>
@@ -1111,15 +978,8 @@
         <w:pStyle w:val="ListBullet"/>
         <w:spacing w:after="20"/>
       </w:pPr>
-      <w:r/>
       <w:r>
-        <w:rPr>
-          <w:highlight w:val="yellow"/>
-        </w:rPr>
-        <w:t>[Add scale: members, countries reached, or revenue range]</w:t>
-      </w:r>
-      <w:r>
-        <w:t>.</w:t>
+        <w:t>Grew the Facebook community to more than 300,000 members, with members from the USA, Canada, the UK and Australia.</w:t>
       </w:r>
     </w:p>
     <w:p>
@@ -1137,7 +997,7 @@
         <w:rPr>
           <w:color w:val="555555"/>
         </w:rPr>
-        <w:t xml:space="preserve">  |  2011 – 2012</w:t>
+        <w:t xml:space="preserve">  |  2011 – 2013</w:t>
       </w:r>
     </w:p>
     <w:p>
@@ -1165,15 +1025,8 @@
         <w:pStyle w:val="ListBullet"/>
         <w:spacing w:after="20"/>
       </w:pPr>
-      <w:r/>
       <w:r>
-        <w:rPr>
-          <w:highlight w:val="yellow"/>
-        </w:rPr>
-        <w:t>[Name client sectors and one programme outcome]</w:t>
-      </w:r>
-      <w:r>
-        <w:t>.</w:t>
+        <w:t>Client: Malaysia Airlines. Redesigned the Enrich frequent flyer programme to give members stronger reasons to keep flying with Malaysia Airlines.</w:t>
       </w:r>
     </w:p>
     <w:p>
@@ -1191,7 +1044,7 @@
         <w:rPr>
           <w:color w:val="555555"/>
         </w:rPr>
-        <w:t xml:space="preserve">  |  2003 – 2011</w:t>
+        <w:t xml:space="preserve">  |  2002 – 2011</w:t>
       </w:r>
     </w:p>
     <w:p>
@@ -1220,16 +1073,7 @@
         <w:spacing w:after="20"/>
       </w:pPr>
       <w:r>
-        <w:t xml:space="preserve">Built and managed the analytics team </w:t>
-      </w:r>
-      <w:r>
-        <w:rPr>
-          <w:highlight w:val="yellow"/>
-        </w:rPr>
-        <w:t>[team size]</w:t>
-      </w:r>
-      <w:r>
-        <w:t xml:space="preserve"> and worked with product, marketing and branch channels on campaign targeting.</w:t>
+        <w:t>Built and managed the campaign management team and worked with product, marketing and branch channels on campaign targeting.</w:t>
       </w:r>
     </w:p>
     <w:p>
@@ -1246,15 +1090,8 @@
         <w:pStyle w:val="ListBullet"/>
         <w:spacing w:after="20"/>
       </w:pPr>
-      <w:r/>
       <w:r>
-        <w:rPr>
-          <w:highlight w:val="yellow"/>
-        </w:rPr>
-        <w:t>[Add 1–2 results, e.g. campaign response uplift, retention gain, revenue contribution]</w:t>
-      </w:r>
-      <w:r>
-        <w:t>.</w:t>
+        <w:t>Helped OCBC Malaysia base more business decisions on customer data by supplying insights to each business unit, which improved retention and revenue from the existing customer base.</w:t>
       </w:r>
     </w:p>
     <w:p>
@@ -1272,7 +1109,7 @@
         <w:rPr>
           <w:color w:val="555555"/>
         </w:rPr>
-        <w:t xml:space="preserve">  |  2000 – 2003</w:t>
+        <w:t xml:space="preserve">  |  2000 – 2002</w:t>
       </w:r>
     </w:p>
     <w:p>
@@ -1300,15 +1137,8 @@
         <w:pStyle w:val="ListBullet"/>
         <w:spacing w:after="20"/>
       </w:pPr>
-      <w:r/>
       <w:r>
-        <w:rPr>
-          <w:highlight w:val="yellow"/>
-        </w:rPr>
-        <w:t>[Name key clients or sectors]</w:t>
-      </w:r>
-      <w:r>
-        <w:t>.</w:t>
+        <w:t>Key clients included Nestlé and British American Tobacco.</w:t>
       </w:r>
     </w:p>
     <w:p>
@@ -1320,13 +1150,13 @@
         <w:rPr>
           <w:b/>
         </w:rPr>
-        <w:t>[[Position]]</w:t>
+        <w:t>Assistant Branch Manager</w:t>
       </w:r>
       <w:r>
         <w:rPr>
           <w:color w:val="555555"/>
         </w:rPr>
-        <w:t xml:space="preserve">  |  [[1997 – 2000]]</w:t>
+        <w:t xml:space="preserve">  |  1997 – 2000</w:t>
       </w:r>
     </w:p>
     <w:p>
@@ -1337,18 +1167,7 @@
         <w:rPr>
           <w:i/>
         </w:rPr>
-      </w:r>
-      <w:r>
-        <w:rPr>
-          <w:i/>
-          <w:highlight w:val="yellow"/>
-        </w:rPr>
-        <w:t>[First employer after UKM]</w:t>
-      </w:r>
-      <w:r>
-        <w:rPr>
-          <w:i/>
-        </w:rPr>
+        <w:t>MMS Consultancy Sdn Bhd, Kuala Lumpur / Bangkok</w:t>
       </w:r>
     </w:p>
     <w:p>
@@ -1356,14 +1175,9 @@
         <w:pStyle w:val="ListBullet"/>
         <w:spacing w:after="20"/>
       </w:pPr>
-      <w:r/>
       <w:r>
-        <w:rPr>
-          <w:highlight w:val="yellow"/>
-        </w:rPr>
-        <w:t>[Describe role]</w:t>
+        <w:t>Led business development for the Kuala Lumpur and Bangkok offices, providing market research and database marketing consultancy to clients across industries.</w:t>
       </w:r>
-      <w:r/>
     </w:p>
     <w:p>
       <w:pPr>
@@ -2012,7 +1826,7 @@
         <w:spacing w:after="20"/>
       </w:pPr>
       <w:r>
-        <w:t>Founder, DigitalAI Business Club (2024 – present).</w:t>
+        <w:t>Founder, DigitalAI Business Club (2025 – present).</w:t>
       </w:r>
     </w:p>
     <w:p>
@@ -2067,16 +1881,7 @@
     </w:p>
     <w:p>
       <w:r>
-        <w:t xml:space="preserve">AI adoption and capability building in Malaysian SMEs: how owner-managers decide where AI fits in their business model, and which readiness factors predict measurable productivity and revenue outcomes. </w:t>
-      </w:r>
-      <w:r>
-        <w:rPr>
-          <w:highlight w:val="yellow"/>
-        </w:rPr>
-        <w:t>[Refine with the supervising professor]</w:t>
-      </w:r>
-      <w:r>
-        <w:t>.</w:t>
+        <w:t>AI adoption and capability building in Malaysian SMEs: how owner-managers decide where AI fits in their business model, and which readiness factors predict measurable productivity and revenue outcomes.</w:t>
       </w:r>
     </w:p>
     <w:sectPr>

</xml_diff>

<commit_message>
Add pre-generative-AI predictive modelling work at OCBC to CV
Co-Authored-By: Claude Opus 5.5 <noreply@anthropic.com>
Claude-Session: https://claude.ai/code/session_01CA6dBC7aRGXKvdWTC2kB5H
</commit_message>
<xml_diff>
--- a/Jane_Chew_CV_DBA_APELQ.docx
+++ b/Jane_Chew_CV_DBA_APELQ.docx
@@ -71,7 +71,7 @@
     </w:p>
     <w:p>
       <w:r>
-        <w:t>Business practitioner with 27 years of experience across customer analytics, CRM and loyalty marketing, digital business, AI strategy and entrepreneurship. Career spans market research and database marketing consultancy (MMS Consultancy, Kuala Lumpur and Bangkok), an international marketing agency (OgilvyOne Worldwide), a regional bank (OCBC Bank, nine years as Head of Customer Analytics &amp; CRM), a global loyalty firm (Aimia / Carlson Marketing), nine years building and running a digital membership business, and, since 2024, founding and running an AI strategy consultancy and business community.</w:t>
+        <w:t>Business practitioner with 27 years of experience across customer analytics, CRM and loyalty marketing, digital business, AI strategy and entrepreneurship. Career spans market research and database marketing consultancy (MMS Consultancy, Kuala Lumpur and Bangkok), an international marketing agency (OgilvyOne Worldwide), a regional bank (OCBC Bank, nine years as Head of Customer Analytics &amp; CRM), a global loyalty firm (Aimia / Carlson Marketing), nine years building and running a digital membership business, and, since 2024, founding and running an AI strategy consultancy and business community. Applied AI in business well before the generative AI era: at OCBC Bank, worked with the AI and predictive modelling team to put customer models into cross-sell and retention campaigns.</w:t>
       </w:r>
     </w:p>
     <w:p>
@@ -1082,6 +1082,15 @@
         <w:spacing w:after="20"/>
       </w:pPr>
       <w:r>
+        <w:t>Worked with the bank's AI and predictive modelling team to build propensity models for cross-sell and retention, and used the model scores to select campaign targets.</w:t>
+      </w:r>
+    </w:p>
+    <w:p>
+      <w:pPr>
+        <w:pStyle w:val="ListBullet"/>
+        <w:spacing w:after="20"/>
+      </w:pPr>
+      <w:r>
         <w:t>Served as in-house trainer (2005–2008), building analytics and CRM capability across internal teams.</w:t>
       </w:r>
     </w:p>

</xml_diff>